<commit_message>
Generalize room selection in UAT guide
</commit_message>
<xml_diff>
--- a/docs/Guia_Pruebas_Aceptacion_Usuario_ChatbotInn.docx
+++ b/docs/Guia_Pruebas_Aceptacion_Usuario_ChatbotInn.docx
@@ -3072,7 +3072,7 @@
                 <w:color w:val="172B3A"/>
                 <w:sz w:val="19"/>
               </w:rPr>
-              <w:t>Tener acceso al módulo Huéspedes del dashboard y un número de WhatsApp distinto al usado en UAT-01.</w:t>
+              <w:t>Tener acceso al módulo Huéspedes del dashboard y utilizar el mismo número de WhatsApp empleado en UAT-01.</w:t>
             </w:r>
           </w:p>
         </w:tc>
@@ -3412,7 +3412,7 @@
                 <w:color w:val="172B3A"/>
                 <w:sz w:val="18"/>
               </w:rPr>
-              <w:t>Crear la habitación UAT-101 y guardarla.</w:t>
+              <w:t>Elegir un número de habitación, confirmar en el catálogo que todavía no exista, crearla y guardarla.</w:t>
             </w:r>
           </w:p>
         </w:tc>
@@ -3593,7 +3593,7 @@
                 <w:color w:val="172B3A"/>
                 <w:sz w:val="18"/>
               </w:rPr>
-              <w:t>Seleccionar UAT-101; registrar check-in actual y check-out dos días después.</w:t>
+              <w:t>Seleccionar la habitación creada; registrar el check-in actual y el check-out dos días después.</w:t>
             </w:r>
           </w:p>
         </w:tc>

</xml_diff>

<commit_message>
Remove unnecessary FAQ dashboard step
</commit_message>
<xml_diff>
--- a/docs/Guia_Pruebas_Aceptacion_Usuario_ChatbotInn.docx
+++ b/docs/Guia_Pruebas_Aceptacion_Usuario_ChatbotInn.docx
@@ -4662,95 +4662,6 @@
         <w:tc>
           <w:tcPr>
             <w:tcW w:type="dxa" w:w="691"/>
-            <w:tcMar>
-              <w:top w:w="80" w:type="dxa"/>
-              <w:start w:w="120" w:type="dxa"/>
-              <w:bottom w:w="80" w:type="dxa"/>
-              <w:end w:w="120" w:type="dxa"/>
-            </w:tcMar>
-            <w:vAlign w:val="center"/>
-          </w:tcPr>
-          <w:p>
-            <w:pPr>
-              <w:spacing w:before="0" w:after="0" w:line="276" w:lineRule="auto"/>
-              <w:jc w:val="center"/>
-            </w:pPr>
-            <w:r/>
-            <w:r>
-              <w:rPr>
-                <w:rFonts w:ascii="Calibri" w:hAnsi="Calibri"/>
-                <w:b/>
-                <w:color w:val="2E74B5"/>
-                <w:sz w:val="20"/>
-              </w:rPr>
-              <w:t>3</w:t>
-            </w:r>
-          </w:p>
-        </w:tc>
-        <w:tc>
-          <w:tcPr>
-            <w:tcW w:type="dxa" w:w="4090"/>
-            <w:tcMar>
-              <w:top w:w="80" w:type="dxa"/>
-              <w:start w:w="120" w:type="dxa"/>
-              <w:bottom w:w="80" w:type="dxa"/>
-              <w:end w:w="120" w:type="dxa"/>
-            </w:tcMar>
-            <w:vAlign w:val="center"/>
-          </w:tcPr>
-          <w:p>
-            <w:pPr>
-              <w:spacing w:before="0" w:after="0" w:line="276" w:lineRule="auto"/>
-              <w:jc w:val="left"/>
-            </w:pPr>
-            <w:r/>
-            <w:r>
-              <w:rPr>
-                <w:rFonts w:ascii="Calibri" w:hAnsi="Calibri"/>
-                <w:b w:val="0"/>
-                <w:color w:val="172B3A"/>
-                <w:sz w:val="18"/>
-              </w:rPr>
-              <w:t>Abrir Solicitudes y localizar la nueva FAQ.</w:t>
-            </w:r>
-          </w:p>
-        </w:tc>
-        <w:tc>
-          <w:tcPr>
-            <w:tcW w:type="dxa" w:w="4579"/>
-            <w:tcMar>
-              <w:top w:w="80" w:type="dxa"/>
-              <w:start w:w="120" w:type="dxa"/>
-              <w:bottom w:w="80" w:type="dxa"/>
-              <w:end w:w="120" w:type="dxa"/>
-            </w:tcMar>
-            <w:vAlign w:val="center"/>
-          </w:tcPr>
-          <w:p>
-            <w:pPr>
-              <w:spacing w:before="0" w:after="0" w:line="276" w:lineRule="auto"/>
-              <w:jc w:val="left"/>
-            </w:pPr>
-            <w:r/>
-            <w:r>
-              <w:rPr>
-                <w:rFonts w:ascii="Calibri" w:hAnsi="Calibri"/>
-                <w:b w:val="0"/>
-                <w:color w:val="172B3A"/>
-                <w:sz w:val="18"/>
-              </w:rPr>
-              <w:t>Existe una sola operación de FAQ; no requiere folio en el texto enviado al huésped y termina como respondida automáticamente.</w:t>
-            </w:r>
-          </w:p>
-        </w:tc>
-      </w:tr>
-      <w:tr>
-        <w:trPr>
-          <w:cantSplit/>
-        </w:trPr>
-        <w:tc>
-          <w:tcPr>
-            <w:tcW w:type="dxa" w:w="691"/>
             <w:shd w:fill="FAFBFC" w:val="clear"/>
             <w:tcMar>
               <w:top w:w="80" w:type="dxa"/>
@@ -4773,7 +4684,7 @@
                 <w:color w:val="2E74B5"/>
                 <w:sz w:val="20"/>
               </w:rPr>
-              <w:t>4</w:t>
+              <w:t>3</w:t>
             </w:r>
           </w:p>
         </w:tc>

</xml_diff>